<commit_message>
added queries for limit offset case
</commit_message>
<xml_diff>
--- a/Insert Update Delete Operations.docx
+++ b/Insert Update Delete Operations.docx
@@ -70,7 +70,7 @@
     <w:p>
       <w:r>
         <w:pict w14:anchorId="4E9E400E">
-          <v:rect id="_x0000_i1163" style="width:0;height:1.5pt" o:hralign="center" o:hrstd="t" o:hr="t" fillcolor="#a0a0a0" stroked="f"/>
+          <v:rect id="_x0000_i1025" style="width:0;height:1.5pt" o:hralign="center" o:hrstd="t" o:hr="t" fillcolor="#a0a0a0" stroked="f"/>
         </w:pict>
       </w:r>
     </w:p>
@@ -101,23 +101,47 @@
     </w:p>
     <w:p>
       <w:r>
-        <w:t>(1,'Nagpur Branch','Sitabuldi, Nagpur','0712-123456'),</w:t>
-      </w:r>
-    </w:p>
-    <w:p>
-      <w:r>
-        <w:t>(2,'Pune Branch','Shivaji Nagar, Pune','020-223344'),</w:t>
-      </w:r>
-    </w:p>
-    <w:p>
-      <w:r>
-        <w:t>(3,'Mumbai Branch','Andheri, Mumbai','022-334455');</w:t>
+        <w:t xml:space="preserve">(1,'Nagpur </w:t>
+      </w:r>
+      <w:proofErr w:type="spellStart"/>
+      <w:r>
+        <w:t>Branch','Sitabuldi</w:t>
+      </w:r>
+      <w:proofErr w:type="spellEnd"/>
+      <w:r>
+        <w:t>, Nagpur','0712-123456'),</w:t>
+      </w:r>
+    </w:p>
+    <w:p>
+      <w:r>
+        <w:t xml:space="preserve">(2,'Pune </w:t>
+      </w:r>
+      <w:proofErr w:type="spellStart"/>
+      <w:r>
+        <w:t>Branch','Shivaji</w:t>
+      </w:r>
+      <w:proofErr w:type="spellEnd"/>
+      <w:r>
+        <w:t xml:space="preserve"> Nagar, Pune','020-223344'),</w:t>
+      </w:r>
+    </w:p>
+    <w:p>
+      <w:r>
+        <w:t xml:space="preserve">(3,'Mumbai </w:t>
+      </w:r>
+      <w:proofErr w:type="spellStart"/>
+      <w:r>
+        <w:t>Branch','Andheri</w:t>
+      </w:r>
+      <w:proofErr w:type="spellEnd"/>
+      <w:r>
+        <w:t>, Mumbai','022-334455');</w:t>
       </w:r>
     </w:p>
     <w:p>
       <w:r>
         <w:pict w14:anchorId="280C2FB4">
-          <v:rect id="_x0000_i1164" style="width:0;height:1.5pt" o:hralign="center" o:hrstd="t" o:hr="t" fillcolor="#a0a0a0" stroked="f"/>
+          <v:rect id="_x0000_i1026" style="width:0;height:1.5pt" o:hralign="center" o:hrstd="t" o:hr="t" fillcolor="#a0a0a0" stroked="f"/>
         </w:pict>
       </w:r>
     </w:p>
@@ -174,7 +198,7 @@
     <w:p>
       <w:r>
         <w:pict w14:anchorId="768EE554">
-          <v:rect id="_x0000_i1165" style="width:0;height:1.5pt" o:hralign="center" o:hrstd="t" o:hr="t" fillcolor="#a0a0a0" stroked="f"/>
+          <v:rect id="_x0000_i1027" style="width:0;height:1.5pt" o:hralign="center" o:hrstd="t" o:hr="t" fillcolor="#a0a0a0" stroked="f"/>
         </w:pict>
       </w:r>
     </w:p>
@@ -232,7 +256,7 @@
     <w:p>
       <w:r>
         <w:pict w14:anchorId="6300B8A8">
-          <v:rect id="_x0000_i1166" style="width:0;height:1.5pt" o:hralign="center" o:hrstd="t" o:hr="t" fillcolor="#a0a0a0" stroked="f"/>
+          <v:rect id="_x0000_i1028" style="width:0;height:1.5pt" o:hralign="center" o:hrstd="t" o:hr="t" fillcolor="#a0a0a0" stroked="f"/>
         </w:pict>
       </w:r>
     </w:p>
@@ -279,7 +303,7 @@
     <w:p>
       <w:r>
         <w:pict w14:anchorId="2DB8E9A9">
-          <v:rect id="_x0000_i1167" style="width:0;height:1.5pt" o:hralign="center" o:hrstd="t" o:hr="t" fillcolor="#a0a0a0" stroked="f"/>
+          <v:rect id="_x0000_i1029" style="width:0;height:1.5pt" o:hralign="center" o:hrstd="t" o:hr="t" fillcolor="#a0a0a0" stroked="f"/>
         </w:pict>
       </w:r>
     </w:p>
@@ -321,7 +345,7 @@
     <w:p>
       <w:r>
         <w:pict w14:anchorId="29E8D010">
-          <v:rect id="_x0000_i1168" style="width:0;height:1.5pt" o:hralign="center" o:hrstd="t" o:hr="t" fillcolor="#a0a0a0" stroked="f"/>
+          <v:rect id="_x0000_i1030" style="width:0;height:1.5pt" o:hralign="center" o:hrstd="t" o:hr="t" fillcolor="#a0a0a0" stroked="f"/>
         </w:pict>
       </w:r>
     </w:p>
@@ -358,7 +382,7 @@
     <w:p>
       <w:r>
         <w:pict w14:anchorId="6382BD38">
-          <v:rect id="_x0000_i1169" style="width:0;height:1.5pt" o:hralign="center" o:hrstd="t" o:hr="t" fillcolor="#a0a0a0" stroked="f"/>
+          <v:rect id="_x0000_i1031" style="width:0;height:1.5pt" o:hralign="center" o:hrstd="t" o:hr="t" fillcolor="#a0a0a0" stroked="f"/>
         </w:pict>
       </w:r>
     </w:p>
@@ -395,7 +419,7 @@
     <w:p>
       <w:r>
         <w:pict w14:anchorId="29A1EB28">
-          <v:rect id="_x0000_i1170" style="width:0;height:1.5pt" o:hralign="center" o:hrstd="t" o:hr="t" fillcolor="#a0a0a0" stroked="f"/>
+          <v:rect id="_x0000_i1032" style="width:0;height:1.5pt" o:hralign="center" o:hrstd="t" o:hr="t" fillcolor="#a0a0a0" stroked="f"/>
         </w:pict>
       </w:r>
     </w:p>
@@ -422,7 +446,7 @@
     <w:p>
       <w:r>
         <w:pict w14:anchorId="43C720E4">
-          <v:rect id="_x0000_i1171" style="width:0;height:1.5pt" o:hralign="center" o:hrstd="t" o:hr="t" fillcolor="#a0a0a0" stroked="f"/>
+          <v:rect id="_x0000_i1033" style="width:0;height:1.5pt" o:hralign="center" o:hrstd="t" o:hr="t" fillcolor="#a0a0a0" stroked="f"/>
         </w:pict>
       </w:r>
     </w:p>
@@ -459,7 +483,7 @@
     <w:p>
       <w:r>
         <w:pict w14:anchorId="4945AFFB">
-          <v:rect id="_x0000_i1172" style="width:0;height:1.5pt" o:hralign="center" o:hrstd="t" o:hr="t" fillcolor="#a0a0a0" stroked="f"/>
+          <v:rect id="_x0000_i1034" style="width:0;height:1.5pt" o:hralign="center" o:hrstd="t" o:hr="t" fillcolor="#a0a0a0" stroked="f"/>
         </w:pict>
       </w:r>
     </w:p>
@@ -486,7 +510,7 @@
     <w:p>
       <w:r>
         <w:pict w14:anchorId="117D1245">
-          <v:rect id="_x0000_i1173" style="width:0;height:1.5pt" o:hralign="center" o:hrstd="t" o:hr="t" fillcolor="#a0a0a0" stroked="f"/>
+          <v:rect id="_x0000_i1035" style="width:0;height:1.5pt" o:hralign="center" o:hrstd="t" o:hr="t" fillcolor="#a0a0a0" stroked="f"/>
         </w:pict>
       </w:r>
     </w:p>
@@ -514,7 +538,7 @@
     <w:p>
       <w:r>
         <w:pict w14:anchorId="06328BA1">
-          <v:rect id="_x0000_i1174" style="width:0;height:1.5pt" o:hralign="center" o:hrstd="t" o:hr="t" fillcolor="#a0a0a0" stroked="f"/>
+          <v:rect id="_x0000_i1036" style="width:0;height:1.5pt" o:hralign="center" o:hrstd="t" o:hr="t" fillcolor="#a0a0a0" stroked="f"/>
         </w:pict>
       </w:r>
     </w:p>
@@ -541,7 +565,7 @@
     <w:p>
       <w:r>
         <w:pict w14:anchorId="5C23598E">
-          <v:rect id="_x0000_i1175" style="width:0;height:1.5pt" o:hralign="center" o:hrstd="t" o:hr="t" fillcolor="#a0a0a0" stroked="f"/>
+          <v:rect id="_x0000_i1037" style="width:0;height:1.5pt" o:hralign="center" o:hrstd="t" o:hr="t" fillcolor="#a0a0a0" stroked="f"/>
         </w:pict>
       </w:r>
     </w:p>
@@ -588,7 +612,7 @@
     <w:p>
       <w:r>
         <w:pict w14:anchorId="532F9405">
-          <v:rect id="_x0000_i1176" style="width:0;height:1.5pt" o:hralign="center" o:hrstd="t" o:hr="t" fillcolor="#a0a0a0" stroked="f"/>
+          <v:rect id="_x0000_i1038" style="width:0;height:1.5pt" o:hralign="center" o:hrstd="t" o:hr="t" fillcolor="#a0a0a0" stroked="f"/>
         </w:pict>
       </w:r>
     </w:p>
@@ -625,7 +649,7 @@
     <w:p>
       <w:r>
         <w:pict w14:anchorId="634E722F">
-          <v:rect id="_x0000_i1177" style="width:0;height:1.5pt" o:hralign="center" o:hrstd="t" o:hr="t" fillcolor="#a0a0a0" stroked="f"/>
+          <v:rect id="_x0000_i1039" style="width:0;height:1.5pt" o:hralign="center" o:hrstd="t" o:hr="t" fillcolor="#a0a0a0" stroked="f"/>
         </w:pict>
       </w:r>
     </w:p>
@@ -667,7 +691,7 @@
     <w:p>
       <w:r>
         <w:pict w14:anchorId="537F6444">
-          <v:rect id="_x0000_i1178" style="width:0;height:1.5pt" o:hralign="center" o:hrstd="t" o:hr="t" fillcolor="#a0a0a0" stroked="f"/>
+          <v:rect id="_x0000_i1040" style="width:0;height:1.5pt" o:hralign="center" o:hrstd="t" o:hr="t" fillcolor="#a0a0a0" stroked="f"/>
         </w:pict>
       </w:r>
     </w:p>
@@ -694,7 +718,7 @@
     <w:p>
       <w:r>
         <w:pict w14:anchorId="593673D2">
-          <v:rect id="_x0000_i1179" style="width:0;height:1.5pt" o:hralign="center" o:hrstd="t" o:hr="t" fillcolor="#a0a0a0" stroked="f"/>
+          <v:rect id="_x0000_i1041" style="width:0;height:1.5pt" o:hralign="center" o:hrstd="t" o:hr="t" fillcolor="#a0a0a0" stroked="f"/>
         </w:pict>
       </w:r>
     </w:p>
@@ -730,7 +754,7 @@
     <w:p>
       <w:r>
         <w:pict w14:anchorId="19062771">
-          <v:rect id="_x0000_i1180" style="width:0;height:1.5pt" o:hralign="center" o:hrstd="t" o:hr="t" fillcolor="#a0a0a0" stroked="f"/>
+          <v:rect id="_x0000_i1042" style="width:0;height:1.5pt" o:hralign="center" o:hrstd="t" o:hr="t" fillcolor="#a0a0a0" stroked="f"/>
         </w:pict>
       </w:r>
     </w:p>
@@ -757,7 +781,7 @@
     <w:p>
       <w:r>
         <w:pict w14:anchorId="1C23DFF6">
-          <v:rect id="_x0000_i1181" style="width:0;height:1.5pt" o:hralign="center" o:hrstd="t" o:hr="t" fillcolor="#a0a0a0" stroked="f"/>
+          <v:rect id="_x0000_i1043" style="width:0;height:1.5pt" o:hralign="center" o:hrstd="t" o:hr="t" fillcolor="#a0a0a0" stroked="f"/>
         </w:pict>
       </w:r>
     </w:p>
@@ -784,7 +808,7 @@
     <w:p>
       <w:r>
         <w:pict w14:anchorId="2753A5E7">
-          <v:rect id="_x0000_i1182" style="width:0;height:1.5pt" o:hralign="center" o:hrstd="t" o:hr="t" fillcolor="#a0a0a0" stroked="f"/>
+          <v:rect id="_x0000_i1044" style="width:0;height:1.5pt" o:hralign="center" o:hrstd="t" o:hr="t" fillcolor="#a0a0a0" stroked="f"/>
         </w:pict>
       </w:r>
     </w:p>
@@ -887,7 +911,7 @@
     <w:p>
       <w:r>
         <w:pict w14:anchorId="4F1057F9">
-          <v:rect id="_x0000_i1183" style="width:0;height:1.5pt" o:hralign="center" o:hrstd="t" o:hr="t" fillcolor="#a0a0a0" stroked="f"/>
+          <v:rect id="_x0000_i1045" style="width:0;height:1.5pt" o:hralign="center" o:hrstd="t" o:hr="t" fillcolor="#a0a0a0" stroked="f"/>
         </w:pict>
       </w:r>
     </w:p>
@@ -964,7 +988,7 @@
     <w:p>
       <w:r>
         <w:pict w14:anchorId="410BC91E">
-          <v:rect id="_x0000_i1184" style="width:0;height:1.5pt" o:hralign="center" o:hrstd="t" o:hr="t" fillcolor="#a0a0a0" stroked="f"/>
+          <v:rect id="_x0000_i1046" style="width:0;height:1.5pt" o:hralign="center" o:hrstd="t" o:hr="t" fillcolor="#a0a0a0" stroked="f"/>
         </w:pict>
       </w:r>
     </w:p>
@@ -1051,7 +1075,7 @@
     <w:p>
       <w:r>
         <w:pict w14:anchorId="7C2F5FAF">
-          <v:rect id="_x0000_i1185" style="width:0;height:1.5pt" o:hralign="center" o:hrstd="t" o:hr="t" fillcolor="#a0a0a0" stroked="f"/>
+          <v:rect id="_x0000_i1047" style="width:0;height:1.5pt" o:hralign="center" o:hrstd="t" o:hr="t" fillcolor="#a0a0a0" stroked="f"/>
         </w:pict>
       </w:r>
     </w:p>
@@ -1212,6 +1236,186 @@
       </w:r>
     </w:p>
     <w:p/>
+    <w:p>
+      <w:r>
+        <w:t>-- Additional Customers</w:t>
+      </w:r>
+    </w:p>
+    <w:p>
+      <w:r>
+        <w:t>INSERT INTO Customers</w:t>
+      </w:r>
+    </w:p>
+    <w:p>
+      <w:r>
+        <w:t>(</w:t>
+      </w:r>
+      <w:proofErr w:type="spellStart"/>
+      <w:r>
+        <w:t>CustomerID</w:t>
+      </w:r>
+      <w:proofErr w:type="spellEnd"/>
+      <w:r>
+        <w:t xml:space="preserve">, FirstName, LastName, Email, Phone, </w:t>
+      </w:r>
+      <w:proofErr w:type="spellStart"/>
+      <w:r>
+        <w:t>AccountCreationDate</w:t>
+      </w:r>
+      <w:proofErr w:type="spellEnd"/>
+      <w:r>
+        <w:t xml:space="preserve">, </w:t>
+      </w:r>
+      <w:proofErr w:type="spellStart"/>
+      <w:r>
+        <w:t>DateOfBirth</w:t>
+      </w:r>
+      <w:proofErr w:type="spellEnd"/>
+      <w:r>
+        <w:t>)</w:t>
+      </w:r>
+    </w:p>
+    <w:p>
+      <w:r>
+        <w:t>VALUES</w:t>
+      </w:r>
+    </w:p>
+    <w:p>
+      <w:r>
+        <w:t>(106,'Priya','Patil','priya@gmail.com',NULL,'2025-03-15','1999-04-18'),</w:t>
+      </w:r>
+    </w:p>
+    <w:p>
+      <w:r>
+        <w:t>(107,'Amit','Verma','amit@gmail.com','9876500001','2025-07-10','1994-02-20'),</w:t>
+      </w:r>
+    </w:p>
+    <w:p>
+      <w:r>
+        <w:t>(108,'Sneha','Kulkarni','sneha@gmail.com',NULL,'2026-01-12','2001-09-05'),</w:t>
+      </w:r>
+    </w:p>
+    <w:p>
+      <w:r>
+        <w:t>(109,'Rohan','Deshmukh','rohan@gmail.com','9876500002','2024-09-08','1997-01-10'),</w:t>
+      </w:r>
+    </w:p>
+    <w:p>
+      <w:r>
+        <w:t>(110,'Pooja','Shah','pooja@gmail.com','9876500003','2025-12-01','1998-12-15');</w:t>
+      </w:r>
+    </w:p>
+    <w:p/>
+    <w:p>
+      <w:r>
+        <w:t>INSERT INTO Accounts</w:t>
+      </w:r>
+    </w:p>
+    <w:p>
+      <w:r>
+        <w:t>(</w:t>
+      </w:r>
+      <w:proofErr w:type="spellStart"/>
+      <w:r>
+        <w:t>AccountID,AccountType,Balance,CustomerID,BranchID</w:t>
+      </w:r>
+      <w:proofErr w:type="spellEnd"/>
+      <w:r>
+        <w:t>)</w:t>
+      </w:r>
+    </w:p>
+    <w:p>
+      <w:r>
+        <w:t>VALUES</w:t>
+      </w:r>
+    </w:p>
+    <w:p>
+      <w:r>
+        <w:t>(1006,'Savings',12000,106,1),</w:t>
+      </w:r>
+    </w:p>
+    <w:p>
+      <w:r>
+        <w:t>(1007,'Current',85000,107,2),</w:t>
+      </w:r>
+    </w:p>
+    <w:p>
+      <w:r>
+        <w:t>(1008,'Savings',50000,108,3),</w:t>
+      </w:r>
+    </w:p>
+    <w:p>
+      <w:r>
+        <w:t>(1009,'Salary',27000,109,2),</w:t>
+      </w:r>
+    </w:p>
+    <w:p>
+      <w:r>
+        <w:t>(1010,'Savings',9500,110,1);</w:t>
+      </w:r>
+    </w:p>
+    <w:p/>
+    <w:p>
+      <w:r>
+        <w:t>INSERT INTO Transactions</w:t>
+      </w:r>
+    </w:p>
+    <w:p>
+      <w:r>
+        <w:t>VALUES</w:t>
+      </w:r>
+    </w:p>
+    <w:p>
+      <w:r>
+        <w:t>(7,'2025-02-10',2500,'Deposit',1006),</w:t>
+      </w:r>
+    </w:p>
+    <w:p>
+      <w:r>
+        <w:t>(8,'2025-02-12',500,'Withdrawal',1006),</w:t>
+      </w:r>
+    </w:p>
+    <w:p>
+      <w:r>
+        <w:t>(9,'2025-02-15',15000,'Deposit',1007),</w:t>
+      </w:r>
+    </w:p>
+    <w:p>
+      <w:r>
+        <w:t>(10,'2025-02-20',3500,'Withdrawal',1008),</w:t>
+      </w:r>
+    </w:p>
+    <w:p>
+      <w:r>
+        <w:t>(11,'2025-03-01',5000,'Deposit',1009),</w:t>
+      </w:r>
+    </w:p>
+    <w:p>
+      <w:r>
+        <w:t>(12,'2025-03-05',4500,'Withdrawal',1010);</w:t>
+      </w:r>
+    </w:p>
+    <w:p>
+      <w:r>
+        <w:lastRenderedPageBreak/>
+        <w:t>INSERT INTO Loans</w:t>
+      </w:r>
+    </w:p>
+    <w:p>
+      <w:r>
+        <w:t>VALUES</w:t>
+      </w:r>
+    </w:p>
+    <w:p>
+      <w:r>
+        <w:t>(504,300000,8.9,'2025-01-01','2030-01-01',106),</w:t>
+      </w:r>
+    </w:p>
+    <w:p>
+      <w:r>
+        <w:t>(505,900000,7.2,'2024-09-01','2034-09-01',108);</w:t>
+      </w:r>
+    </w:p>
     <w:sectPr>
       <w:pgSz w:w="11906" w:h="16838"/>
       <w:pgMar w:top="1440" w:right="1440" w:bottom="1440" w:left="1440" w:header="708" w:footer="708" w:gutter="0"/>

</xml_diff>